<commit_message>
Replace compliance-sync CI runner with a Claude skill (verify vs main)
- Remove .github/workflows/compliance-sync.yml — auto-committing doc edits back to
  main was the wrong pattern.
- Add .claude/skills/compliance-doc-sync/SKILL.md: verifies docs/compliance 01-10
  against the LATEST main, reports control/drift, and drives edits through Claude
  with human review (never auto-commits). Reuses scripts/compliance/compliance_sync.py
  as the deterministic check engine.
- Update compliance_sync.py docstring and doc references (07,08,09,10) to point at
  the skill instead of the removed runner; regenerate affected Word docs.

Co-Authored-By: Claude Opus 4.8 <noreply@anthropic.com>
</commit_message>
<xml_diff>
--- a/docs/compliance/07-SDLC-Change-Management-Tracker.docx
+++ b/docs/compliance/07-SDLC-Change-Management-Tracker.docx
@@ -1526,7 +1526,22 @@
         <w:t xml:space="preserve">COMPLIANCE-STATUS.md</w:t>
       </w:r>
       <w:r>
-        <w:t xml:space="preserve">, auto-checked by the compliance-sync CI on</w:t>
+        <w:t xml:space="preserve">, verified via the</w:t>
+      </w:r>
+      <w:r>
+        <w:t xml:space="preserve"> </w:t>
+      </w:r>
+      <w:r>
+        <w:rPr>
+          <w:rStyle w:val="VerbatimChar"/>
+        </w:rPr>
+        <w:t xml:space="preserve">compliance-doc-sync</w:t>
+      </w:r>
+      <w:r>
+        <w:t xml:space="preserve"> </w:t>
+      </w:r>
+      <w:r>
+        <w:t xml:space="preserve">Claude skill against the latest</w:t>
       </w:r>
       <w:r>
         <w:t xml:space="preserve"> </w:t>
@@ -1858,30 +1873,57 @@
               <w:rPr>
                 <w:rStyle w:val="VerbatimChar"/>
               </w:rPr>
-              <w:t xml:space="preserve">compliance-sync</w:t>
+              <w:t xml:space="preserve">compliance-doc-sync</w:t>
             </w:r>
             <w:r>
               <w:t xml:space="preserve"> </w:t>
             </w:r>
             <w:r>
-              <w:t xml:space="preserve">workflow (main only)</w:t>
-            </w:r>
-          </w:p>
-        </w:tc>
-        <w:tc>
-          <w:tcPr/>
-          <w:p>
-            <w:pPr>
-              <w:pStyle w:val="Compact"/>
-            </w:pPr>
+              <w:t xml:space="preserve">skill +</w:t>
+            </w:r>
+            <w:r>
+              <w:t xml:space="preserve"> </w:t>
+            </w:r>
             <w:r>
               <w:rPr>
                 <w:rStyle w:val="VerbatimChar"/>
               </w:rPr>
+              <w:t xml:space="preserve">compliance_sync.py</w:t>
+            </w:r>
+            <w:r>
+              <w:t xml:space="preserve"> </w:t>
+            </w:r>
+            <w:r>
+              <w:t xml:space="preserve">(verify docs vs latest</w:t>
+            </w:r>
+            <w:r>
+              <w:t xml:space="preserve"> </w:t>
+            </w:r>
+            <w:r>
+              <w:rPr>
+                <w:rStyle w:val="VerbatimChar"/>
+              </w:rPr>
+              <w:t xml:space="preserve">main</w:t>
+            </w:r>
+            <w:r>
+              <w:t xml:space="preserve">)</w:t>
+            </w:r>
+          </w:p>
+        </w:tc>
+        <w:tc>
+          <w:tcPr/>
+          <w:p>
+            <w:pPr>
+              <w:pStyle w:val="Compact"/>
+            </w:pPr>
+            <w:r>
+              <w:rPr>
+                <w:rStyle w:val="VerbatimChar"/>
+              </w:rPr>
               <w:t xml:space="preserve">COMPLIANCE-STATUS.md</w:t>
             </w:r>
             <w:r>
-              <w:t xml:space="preserve">, CSV, PR gate</w:t>
+              <w:t xml:space="preserve">, CSV, drift report</w:t>
             </w:r>
           </w:p>
         </w:tc>

</xml_diff>